<commit_message>
Retarget Capital One demo to Hygieia Java 11 to 17 upgrade
Co-Authored-By: Devin AI <158243242+devin-ai-integration[bot]@users.noreply.github.com>
</commit_message>
<xml_diff>
--- a/pitch/CapitalOne_Demo_Walkthrough.docx
+++ b/pitch/CapitalOne_Demo_Walkthrough.docx
@@ -7,7 +7,7 @@
         <w:pStyle w:val="Title"/>
       </w:pPr>
       <w:r>
-        <w:t>Devin Demo Walkthrough — Capital One / DataProfiler</w:t>
+        <w:t>Devin Demo Walkthrough — Capital One / Hygieia Java 11 to 17</w:t>
       </w:r>
     </w:p>
     <w:p>
@@ -220,7 +220,7 @@
                 <w:b/>
                 <w:sz w:val="19"/>
               </w:rPr>
-              <w:t>Session</w:t>
+              <w:t>Playbook + Session</w:t>
             </w:r>
           </w:p>
         </w:tc>
@@ -238,7 +238,20 @@
               <w:rPr>
                 <w:sz w:val="19"/>
               </w:rPr>
-              <w:t>One task, one Devin, one VM, from prompt to PR</w:t>
+              <w:t xml:space="preserve">A playbook is a saved, reusable prompt (yours is </w:t>
+            </w:r>
+            <w:r>
+              <w:rPr>
+                <w:rFonts w:ascii="Consolas" w:hAnsi="Consolas"/>
+                <w:sz w:val="19"/>
+              </w:rPr>
+              <w:t>!java17_upgrade</w:t>
+            </w:r>
+            <w:r>
+              <w:rPr>
+                <w:sz w:val="19"/>
+              </w:rPr>
+              <w:t>); a session is one Devin running it in one VM, from prompt to PR</w:t>
             </w:r>
           </w:p>
         </w:tc>
@@ -256,7 +269,7 @@
               <w:rPr>
                 <w:sz w:val="19"/>
               </w:rPr>
-              <w:t>Discover integration backlog; data-governance tooling</w:t>
+              <w:t>Discover integration backlog; modernization at scale</w:t>
             </w:r>
           </w:p>
         </w:tc>
@@ -453,7 +466,7 @@
         <w:t>The story you are telling.</w:t>
       </w:r>
       <w:r>
-        <w:t xml:space="preserve"> "A Discover engineer joins a Capital One repo on Monday (Wiki). A data-governance ticket comes in on Slack (Session). The PR gets a second reader automatically (Review). Meanwhile Devin keeps the repo patched every week without being asked (Automation). And all of it happens inside controls your CISO can audit (Security)."</w:t>
+        <w:t xml:space="preserve"> "A Discover engineer lands in a Capital One Java repo on Monday that nobody who wrote it still maintains (Wiki). A modernization ticket says: get it onto Java 17 (Playbook + Session). The PR gets a second reader automatically (Review). Meanwhile Devin keeps the repo patched every week without being asked (Automation). And all of it happens inside controls your CISO can audit (Security)."</w:t>
       </w:r>
     </w:p>
     <w:p>
@@ -464,7 +477,57 @@
         <w:t>Golden rule:</w:t>
       </w:r>
       <w:r>
-        <w:t xml:space="preserve"> always have a finished session and open PR from the night before. If the live session is slow, you narrate the finished one. Nobody will know or care.</w:t>
+        <w:t xml:space="preserve"> the full two-repo upgrade takes longer than 15 minutes, so the completed sessions and PRs from your earlier run are the main exhibit. The live session only needs to be visibly </w:t>
+      </w:r>
+      <w:r>
+        <w:rPr>
+          <w:i/>
+        </w:rPr>
+        <w:t>working</w:t>
+      </w:r>
+      <w:r>
+        <w:t xml:space="preserve"> (building, running tests). You narrate the finished ones.</w:t>
+      </w:r>
+    </w:p>
+    <w:p>
+      <w:r>
+        <w:rPr>
+          <w:b/>
+        </w:rPr>
+        <w:t>The two repos, in one sentence each.</w:t>
+      </w:r>
+      <w:r>
+        <w:t xml:space="preserve"> </w:t>
+      </w:r>
+      <w:r>
+        <w:rPr>
+          <w:rFonts w:ascii="Consolas" w:hAnsi="Consolas"/>
+          <w:sz w:val="20"/>
+        </w:rPr>
+        <w:t>hygieia-core</w:t>
+      </w:r>
+      <w:r>
+        <w:t xml:space="preserve"> is the shared library (domain models, MongoDB persistence) that everything else depends on. </w:t>
+      </w:r>
+      <w:r>
+        <w:rPr>
+          <w:rFonts w:ascii="Consolas" w:hAnsi="Consolas"/>
+          <w:sz w:val="20"/>
+        </w:rPr>
+        <w:t>api</w:t>
+      </w:r>
+      <w:r>
+        <w:t xml:space="preserve"> is the REST service that depends on core. Rule: upgrade core first, </w:t>
+      </w:r>
+      <w:r>
+        <w:rPr>
+          <w:rFonts w:ascii="Consolas" w:hAnsi="Consolas"/>
+          <w:sz w:val="20"/>
+        </w:rPr>
+        <w:t>mvn install</w:t>
+      </w:r>
+      <w:r>
+        <w:t xml:space="preserve"> it locally, then upgrade api. Say this rule out loud in the demo; it is what makes the work look like real engineering.</w:t>
       </w:r>
     </w:p>
     <w:p>
@@ -472,7 +535,12 @@
         <w:pStyle w:val="Heading1"/>
       </w:pPr>
       <w:r>
-        <w:t>Part B. Setup — the day before (about 90 minutes)</w:t>
+        <w:t>Part B. Setup — the day before (about 60 minutes)</w:t>
+      </w:r>
+    </w:p>
+    <w:p>
+      <w:r>
+        <w:t>Most of this is already done from your earlier upgrade work; treat it as a checklist.</w:t>
       </w:r>
     </w:p>
     <w:p>
@@ -480,7 +548,7 @@
         <w:pStyle w:val="Heading2"/>
       </w:pPr>
       <w:r>
-        <w:t>B1. Fork the repo</w:t>
+        <w:t>B1. Confirm the forks</w:t>
       </w:r>
     </w:p>
     <w:p>
@@ -491,26 +559,27 @@
         <w:t>Do.</w:t>
       </w:r>
       <w:r>
-        <w:t xml:space="preserve"> Sign in to GitHub. Go to https://github.com/capitalone/DataProfiler and click </w:t>
-      </w:r>
-      <w:r>
-        <w:rPr>
-          <w:b/>
-        </w:rPr>
-        <w:t>Fork</w:t>
-      </w:r>
-      <w:r>
-        <w:t xml:space="preserve"> (top right). Fork into your own account (e.g. </w:t>
+        <w:t xml:space="preserve"> Check https://github.com/robertsljoseph-crypto/hygieia-core and https://github.com/robertsljoseph-crypto/api exist and that each has a </w:t>
       </w:r>
       <w:r>
         <w:rPr>
           <w:rFonts w:ascii="Consolas" w:hAnsi="Consolas"/>
           <w:sz w:val="20"/>
         </w:rPr>
-        <w:t>robertsljoseph-crypto/DataProfiler</w:t>
+        <w:t>master</w:t>
       </w:r>
       <w:r>
-        <w:t>). Leave "Copy the main branch only" checked.</w:t>
+        <w:t>/</w:t>
+      </w:r>
+      <w:r>
+        <w:rPr>
+          <w:rFonts w:ascii="Consolas" w:hAnsi="Consolas"/>
+          <w:sz w:val="20"/>
+        </w:rPr>
+        <w:t>main</w:t>
+      </w:r>
+      <w:r>
+        <w:t xml:space="preserve"> branch still on Java 11 (the branch you will upgrade live) plus the Java 17 PRs from your earlier run. If the earlier PRs were merged, create a fresh branch from the pre-upgrade commit so the live run has something to do. If the upgrade PRs are still open, leave them open.</w:t>
       </w:r>
     </w:p>
     <w:p>
@@ -521,7 +590,7 @@
         <w:t>Why.</w:t>
       </w:r>
       <w:r>
-        <w:t xml:space="preserve"> You cannot open PRs into Capital One's real repo during a demo, and you should not. A fork is a full copy under your control: same code, same tests, same CI config. Everything Devin does lands in your fork.</w:t>
+        <w:t xml:space="preserve"> The upstream org (github.com/Hygieia) is archived, so the forks are the only place PRs can land. You need a "before" branch for the live session and a finished "after" PR for the narration.</w:t>
       </w:r>
     </w:p>
     <w:p>
@@ -540,52 +609,16 @@
         <w:t>Do.</w:t>
       </w:r>
       <w:r>
-        <w:t xml:space="preserve"> In Devin (https://app.devin.ai), open </w:t>
+        <w:t xml:space="preserve"> In Devin (https://app.devin.ai), </w:t>
       </w:r>
       <w:r>
         <w:rPr>
           <w:b/>
         </w:rPr>
-        <w:t>Settings</w:t>
+        <w:t>Settings → Integrations → GitHub</w:t>
       </w:r>
       <w:r>
-        <w:t xml:space="preserve"> (gear icon, bottom left) → </w:t>
-      </w:r>
-      <w:r>
-        <w:rPr>
-          <w:b/>
-        </w:rPr>
-        <w:t>Integrations</w:t>
-      </w:r>
-      <w:r>
-        <w:t xml:space="preserve"> → </w:t>
-      </w:r>
-      <w:r>
-        <w:rPr>
-          <w:b/>
-        </w:rPr>
-        <w:t>GitHub</w:t>
-      </w:r>
-      <w:r>
-        <w:t xml:space="preserve">. Click </w:t>
-      </w:r>
-      <w:r>
-        <w:rPr>
-          <w:b/>
-        </w:rPr>
-        <w:t>Install / Configure</w:t>
-      </w:r>
-      <w:r>
-        <w:t xml:space="preserve"> and, in the GitHub screen that opens, grant access to </w:t>
-      </w:r>
-      <w:r>
-        <w:rPr>
-          <w:b/>
-        </w:rPr>
-        <w:t>only</w:t>
-      </w:r>
-      <w:r>
-        <w:t xml:space="preserve"> the DataProfiler fork (choose "Only select repositories"). Come back to Devin and confirm the repo appears in the list.</w:t>
+        <w:t>. Confirm both forks are in the list of repos the Devin GitHub App can see, and nothing else that you do not want on screen.</w:t>
       </w:r>
     </w:p>
     <w:p>
@@ -605,7 +638,7 @@
         <w:t>GitHub App</w:t>
       </w:r>
       <w:r>
-        <w:t>, not a personal password. The App has a scoped identity: it can only see the repos you selected. This is a security talking point you will reuse in Step 5: "Devin has exactly the access you granted it, and nothing else."</w:t>
+        <w:t xml:space="preserve"> with a scoped identity: it can only see the repos you selected. You reuse this in Step 5: "Devin has exactly the access you granted it, and nothing else."</w:t>
       </w:r>
     </w:p>
     <w:p>
@@ -613,252 +646,7 @@
         <w:pStyle w:val="Heading2"/>
       </w:pPr>
       <w:r>
-        <w:t>B3. Set up the repo environment (so sessions start fast)</w:t>
-      </w:r>
-    </w:p>
-    <w:p>
-      <w:r>
-        <w:rPr>
-          <w:b/>
-        </w:rPr>
-        <w:t>Do.</w:t>
-      </w:r>
-      <w:r>
-        <w:t xml:space="preserve"> In Devin, go to </w:t>
-      </w:r>
-      <w:r>
-        <w:rPr>
-          <w:b/>
-        </w:rPr>
-        <w:t>Settings → Repositories</w:t>
-      </w:r>
-      <w:r>
-        <w:t xml:space="preserve"> (sometimes labelled "Environments" or "Machine"), pick the fork and click </w:t>
-      </w:r>
-      <w:r>
-        <w:rPr>
-          <w:b/>
-        </w:rPr>
-        <w:t>Set up</w:t>
-      </w:r>
-      <w:r>
-        <w:t xml:space="preserve"> or </w:t>
-      </w:r>
-      <w:r>
-        <w:rPr>
-          <w:b/>
-        </w:rPr>
-        <w:t>Configure</w:t>
-      </w:r>
-      <w:r>
-        <w:t>. Devin opens a setup session where it clones the repo and tries to install dependencies. Tell it, in the chat:</w:t>
-      </w:r>
-    </w:p>
-    <w:p>
-      <w:pPr>
-        <w:ind w:left="576"/>
-      </w:pPr>
-      <w:r>
-        <w:t xml:space="preserve">Install DataProfiler for development: </w:t>
-      </w:r>
-      <w:r>
-        <w:rPr>
-          <w:rFonts w:ascii="Consolas" w:hAnsi="Consolas"/>
-          <w:sz w:val="20"/>
-        </w:rPr>
-        <w:t>pip install -e ".[ml,reports]" -r requirements-dev.txt -r requirements-test.txt</w:t>
-      </w:r>
-      <w:r>
-        <w:t xml:space="preserve">. Then confirm </w:t>
-      </w:r>
-      <w:r>
-        <w:rPr>
-          <w:rFonts w:ascii="Consolas" w:hAnsi="Consolas"/>
-          <w:sz w:val="20"/>
-        </w:rPr>
-        <w:t>pytest dataprofiler/tests/profilers/test_profile_builder.py -q</w:t>
-      </w:r>
-      <w:r>
-        <w:t xml:space="preserve"> passes and </w:t>
-      </w:r>
-      <w:r>
-        <w:rPr>
-          <w:rFonts w:ascii="Consolas" w:hAnsi="Consolas"/>
-          <w:sz w:val="20"/>
-        </w:rPr>
-        <w:t>pre-commit run --all-files</w:t>
-      </w:r>
-      <w:r>
-        <w:t xml:space="preserve"> works. Save this as the repo setup so future sessions start with everything installed.</w:t>
-      </w:r>
-    </w:p>
-    <w:p>
-      <w:r>
-        <w:t>When it finishes, it will propose saving a "snapshot" or environment configuration. Accept it.</w:t>
-      </w:r>
-    </w:p>
-    <w:p>
-      <w:r>
-        <w:rPr>
-          <w:b/>
-        </w:rPr>
-        <w:t>Why.</w:t>
-      </w:r>
-      <w:r>
-        <w:t xml:space="preserve"> Every Devin session starts from a fresh VM. Without a saved environment, each session would spend 5-10 minutes installing Python packages before doing any work. Saving the setup once means the live demo session starts working in under a minute. It also proves a point to the CIO: "Devin learned how to build your repo once; every engineer and every future session inherits that."</w:t>
-      </w:r>
-    </w:p>
-    <w:p>
-      <w:pPr>
-        <w:pStyle w:val="Heading2"/>
-      </w:pPr>
-      <w:r>
-        <w:t>B4. Generate the Wiki</w:t>
-      </w:r>
-    </w:p>
-    <w:p>
-      <w:r>
-        <w:rPr>
-          <w:b/>
-        </w:rPr>
-        <w:t>Do.</w:t>
-      </w:r>
-      <w:r>
-        <w:t xml:space="preserve"> In Devin, open </w:t>
-      </w:r>
-      <w:r>
-        <w:rPr>
-          <w:b/>
-        </w:rPr>
-        <w:t>Wiki</w:t>
-      </w:r>
-      <w:r>
-        <w:t xml:space="preserve"> (left sidebar; may also be reachable at deepwiki.com for public repos). Click </w:t>
-      </w:r>
-      <w:r>
-        <w:rPr>
-          <w:b/>
-        </w:rPr>
-        <w:t>Add repository</w:t>
-      </w:r>
-      <w:r>
-        <w:t xml:space="preserve"> / </w:t>
-      </w:r>
-      <w:r>
-        <w:rPr>
-          <w:b/>
-        </w:rPr>
-        <w:t>Index</w:t>
-      </w:r>
-      <w:r>
-        <w:t>, choose the fork, and wait. Indexing a 60k-line repo takes a few minutes. When done, open it and skim the pages so you know where "Architecture", "Data Readers", "Profilers", "Labelers" and "Reports" live.</w:t>
-      </w:r>
-    </w:p>
-    <w:p>
-      <w:r>
-        <w:t>Then test the question you will ask live. In the Wiki's chat box type:</w:t>
-      </w:r>
-    </w:p>
-    <w:p>
-      <w:pPr>
-        <w:ind w:left="576"/>
-      </w:pPr>
-      <w:r>
-        <w:t xml:space="preserve">How does </w:t>
-      </w:r>
-      <w:r>
-        <w:rPr>
-          <w:rFonts w:ascii="Consolas" w:hAnsi="Consolas"/>
-          <w:sz w:val="20"/>
-        </w:rPr>
-        <w:t>Profiler.report()</w:t>
-      </w:r>
-      <w:r>
-        <w:t xml:space="preserve"> choose an output format, and where are the different formats tested?</w:t>
-      </w:r>
-    </w:p>
-    <w:p>
-      <w:r>
-        <w:t xml:space="preserve">Read the answer. It should point at </w:t>
-      </w:r>
-      <w:r>
-        <w:rPr>
-          <w:rFonts w:ascii="Consolas" w:hAnsi="Consolas"/>
-          <w:sz w:val="20"/>
-        </w:rPr>
-        <w:t>dataprofiler/profilers/helpers/report_helpers.py</w:t>
-      </w:r>
-      <w:r>
-        <w:t xml:space="preserve"> (the </w:t>
-      </w:r>
-      <w:r>
-        <w:rPr>
-          <w:rFonts w:ascii="Consolas" w:hAnsi="Consolas"/>
-          <w:sz w:val="20"/>
-        </w:rPr>
-        <w:t>pretty</w:t>
-      </w:r>
-      <w:r>
-        <w:t xml:space="preserve">, </w:t>
-      </w:r>
-      <w:r>
-        <w:rPr>
-          <w:rFonts w:ascii="Consolas" w:hAnsi="Consolas"/>
-          <w:sz w:val="20"/>
-        </w:rPr>
-        <w:t>compact</w:t>
-      </w:r>
-      <w:r>
-        <w:t xml:space="preserve">, </w:t>
-      </w:r>
-      <w:r>
-        <w:rPr>
-          <w:rFonts w:ascii="Consolas" w:hAnsi="Consolas"/>
-          <w:sz w:val="20"/>
-        </w:rPr>
-        <w:t>serializable</w:t>
-      </w:r>
-      <w:r>
-        <w:t xml:space="preserve">, </w:t>
-      </w:r>
-      <w:r>
-        <w:rPr>
-          <w:rFonts w:ascii="Consolas" w:hAnsi="Consolas"/>
-          <w:sz w:val="20"/>
-        </w:rPr>
-        <w:t>flat</w:t>
-      </w:r>
-      <w:r>
-        <w:t xml:space="preserve"> formats) and the tests under </w:t>
-      </w:r>
-      <w:r>
-        <w:rPr>
-          <w:rFonts w:ascii="Consolas" w:hAnsi="Consolas"/>
-          <w:sz w:val="20"/>
-        </w:rPr>
-        <w:t>dataprofiler/tests/profilers/</w:t>
-      </w:r>
-      <w:r>
-        <w:t>. If it does, you have your Step 1 in the bag.</w:t>
-      </w:r>
-    </w:p>
-    <w:p>
-      <w:r>
-        <w:rPr>
-          <w:b/>
-        </w:rPr>
-        <w:t>Why.</w:t>
-      </w:r>
-      <w:r>
-        <w:t xml:space="preserve"> The Wiki is the "day one for a new engineer" story. It also quietly proves Devin has understood the codebase before it touches it, which is what makes the CIO trust the PR later.</w:t>
-      </w:r>
-    </w:p>
-    <w:p>
-      <w:pPr>
-        <w:pStyle w:val="Heading2"/>
-      </w:pPr>
-      <w:r>
-        <w:t>B5. Turn on Devin Review</w:t>
+        <w:t>B3. Repo environment (Configure index + Configure blueprint)</w:t>
       </w:r>
     </w:p>
     <w:p>
@@ -875,19 +663,121 @@
         <w:rPr>
           <w:b/>
         </w:rPr>
-        <w:t>Settings → Integrations → GitHub → Devin Review</w:t>
+        <w:t>Settings → Repositories</w:t>
       </w:r>
       <w:r>
-        <w:t xml:space="preserve"> (or </w:t>
+        <w:t xml:space="preserve">, pick </w:t>
+      </w:r>
+      <w:r>
+        <w:rPr>
+          <w:rFonts w:ascii="Consolas" w:hAnsi="Consolas"/>
+          <w:sz w:val="20"/>
+        </w:rPr>
+        <w:t>hygieia-core</w:t>
+      </w:r>
+      <w:r>
+        <w:t xml:space="preserve">. Click </w:t>
       </w:r>
       <w:r>
         <w:rPr>
           <w:b/>
         </w:rPr>
-        <w:t>Settings → Review</w:t>
+        <w:t>Configure index</w:t>
       </w:r>
       <w:r>
-        <w:t>). Enable it for the fork. Choose "review all PRs" if offered.</w:t>
+        <w:t xml:space="preserve"> → Add branch → the default branch → save. Then </w:t>
+      </w:r>
+      <w:r>
+        <w:rPr>
+          <w:b/>
+        </w:rPr>
+        <w:t>Configure blueprint</w:t>
+      </w:r>
+      <w:r>
+        <w:t>. In the setup session say:</w:t>
+      </w:r>
+    </w:p>
+    <w:p>
+      <w:pPr>
+        <w:ind w:left="576"/>
+      </w:pPr>
+      <w:r>
+        <w:t xml:space="preserve">Build with Java 17: </w:t>
+      </w:r>
+      <w:r>
+        <w:rPr>
+          <w:rFonts w:ascii="Consolas" w:hAnsi="Consolas"/>
+          <w:sz w:val="20"/>
+        </w:rPr>
+        <w:t>export JAVA_HOME=/usr/lib/jvm/java-17-openjdk-amd64</w:t>
+      </w:r>
+      <w:r>
+        <w:t xml:space="preserve"> then </w:t>
+      </w:r>
+      <w:r>
+        <w:rPr>
+          <w:rFonts w:ascii="Consolas" w:hAnsi="Consolas"/>
+          <w:sz w:val="20"/>
+        </w:rPr>
+        <w:t>mvn -B clean install</w:t>
+      </w:r>
+      <w:r>
+        <w:t xml:space="preserve">. Also keep Java 11 available for the baseline build. Maven Central returns 429 from this network, so keep the Google mirror in </w:t>
+      </w:r>
+      <w:r>
+        <w:rPr>
+          <w:rFonts w:ascii="Consolas" w:hAnsi="Consolas"/>
+          <w:sz w:val="20"/>
+        </w:rPr>
+        <w:t>~/.m2/settings.xml</w:t>
+      </w:r>
+      <w:r>
+        <w:t>. Save this as the repo setup.</w:t>
+      </w:r>
+    </w:p>
+    <w:p>
+      <w:r>
+        <w:t xml:space="preserve">Repeat for </w:t>
+      </w:r>
+      <w:r>
+        <w:rPr>
+          <w:rFonts w:ascii="Consolas" w:hAnsi="Consolas"/>
+          <w:sz w:val="20"/>
+        </w:rPr>
+        <w:t>api</w:t>
+      </w:r>
+      <w:r>
+        <w:t>, adding: "</w:t>
+      </w:r>
+      <w:r>
+        <w:rPr>
+          <w:rFonts w:ascii="Consolas" w:hAnsi="Consolas"/>
+          <w:sz w:val="20"/>
+        </w:rPr>
+        <w:t>api</w:t>
+      </w:r>
+      <w:r>
+        <w:t xml:space="preserve"> depends on </w:t>
+      </w:r>
+      <w:r>
+        <w:rPr>
+          <w:rFonts w:ascii="Consolas" w:hAnsi="Consolas"/>
+          <w:sz w:val="20"/>
+        </w:rPr>
+        <w:t>hygieia-core</w:t>
+      </w:r>
+      <w:r>
+        <w:t xml:space="preserve">; clone and </w:t>
+      </w:r>
+      <w:r>
+        <w:rPr>
+          <w:rFonts w:ascii="Consolas" w:hAnsi="Consolas"/>
+          <w:sz w:val="20"/>
+        </w:rPr>
+        <w:t>mvn install</w:t>
+      </w:r>
+      <w:r>
+        <w:t xml:space="preserve"> core first."</w:t>
       </w:r>
     </w:p>
     <w:p>
@@ -898,7 +788,7 @@
         <w:t>Why.</w:t>
       </w:r>
       <w:r>
-        <w:t xml:space="preserve"> Review is what makes Step 3 happen automatically: the moment Devin's PR opens, Review comments on it. If you skip this, you will have nothing to show in Step 3.</w:t>
+        <w:t xml:space="preserve"> Index = Devin's knowledge of the code (feeds the Wiki). Blueprint = a ready-to-run machine with both JDKs and Maven cached, so the live session starts compiling in under a minute instead of downloading the internet. Point to the CIO: "Devin learned how to build your repo once; every future session inherits that."</w:t>
       </w:r>
     </w:p>
     <w:p>
@@ -906,7 +796,59 @@
         <w:pStyle w:val="Heading2"/>
       </w:pPr>
       <w:r>
-        <w:t>B6. Connect Slack (optional but strong)</w:t>
+        <w:t>B4. Generate the Wiki and test your question</w:t>
+      </w:r>
+    </w:p>
+    <w:p>
+      <w:r>
+        <w:rPr>
+          <w:b/>
+        </w:rPr>
+        <w:t>Do.</w:t>
+      </w:r>
+      <w:r>
+        <w:t xml:space="preserve"> Open </w:t>
+      </w:r>
+      <w:r>
+        <w:rPr>
+          <w:b/>
+        </w:rPr>
+        <w:t>Wiki</w:t>
+      </w:r>
+      <w:r>
+        <w:t>, add both forks if not already indexed, skim the pages so you know where the module map, persistence layer and build/CI pages are. In the chat box type:</w:t>
+      </w:r>
+    </w:p>
+    <w:p>
+      <w:pPr>
+        <w:ind w:left="576"/>
+      </w:pPr>
+      <w:r>
+        <w:t>What in hygieia-core is likely to break when moving from Java 11 to Java 17, and in what order should hygieia-core and api be upgraded?</w:t>
+      </w:r>
+    </w:p>
+    <w:p>
+      <w:r>
+        <w:t>Read the answer. If it is good, that is your live question. If weak, try: "Explain how api depends on hygieia-core and how a change in core reaches api."</w:t>
+      </w:r>
+    </w:p>
+    <w:p>
+      <w:r>
+        <w:rPr>
+          <w:b/>
+        </w:rPr>
+        <w:t>Why.</w:t>
+      </w:r>
+      <w:r>
+        <w:t xml:space="preserve"> The Wiki answer is the "day one for a Discover engineer" moment. Testing it tonight removes the one live risk in Step 1.</w:t>
+      </w:r>
+    </w:p>
+    <w:p>
+      <w:pPr>
+        <w:pStyle w:val="Heading2"/>
+      </w:pPr>
+      <w:r>
+        <w:t>B5. Read your playbook</w:t>
       </w:r>
     </w:p>
     <w:p>
@@ -923,30 +865,39 @@
         <w:rPr>
           <w:b/>
         </w:rPr>
-        <w:t>Settings → Integrations → Slack → Add to Slack</w:t>
+        <w:t>Settings → Playbooks</w:t>
       </w:r>
       <w:r>
-        <w:t xml:space="preserve">. Pick a Slack workspace you control (a free one is fine). Create a channel called </w:t>
+        <w:t xml:space="preserve"> → open </w:t>
+      </w:r>
+      <w:r>
+        <w:rPr>
+          <w:b/>
+        </w:rPr>
+        <w:t>java17_upgrade</w:t>
+      </w:r>
+      <w:r>
+        <w:t xml:space="preserve"> (https://app.devin.ai/settings/playbooks/458207650b564b0c85816afba77587e7). Read it once. Its steps, in plain words: baseline build and tests on Java 11; bump </w:t>
       </w:r>
       <w:r>
         <w:rPr>
           <w:rFonts w:ascii="Consolas" w:hAnsi="Consolas"/>
           <w:sz w:val="20"/>
         </w:rPr>
-        <w:t>#eng-data-governance</w:t>
+        <w:t>java.version</w:t>
       </w:r>
       <w:r>
-        <w:t xml:space="preserve">, invite the </w:t>
+        <w:t xml:space="preserve"> / compiler to 17; upgrade the build plugins that choke on JDK 17 (spotbugs → 4.8.6.6, pmd → 3.21.0, jacoco → 0.8.12); keep Spring Boot 2.x; fix tests properly rather than skipping them; core first, </w:t>
       </w:r>
       <w:r>
         <w:rPr>
           <w:rFonts w:ascii="Consolas" w:hAnsi="Consolas"/>
           <w:sz w:val="20"/>
         </w:rPr>
-        <w:t>@Devin</w:t>
+        <w:t>mvn install</w:t>
       </w:r>
       <w:r>
-        <w:t xml:space="preserve"> bot to it.</w:t>
+        <w:t>, then api; one PR per repo.</w:t>
       </w:r>
     </w:p>
     <w:p>
@@ -957,7 +908,7 @@
         <w:t>Why.</w:t>
       </w:r>
       <w:r>
-        <w:t xml:space="preserve"> Kicking the task off from Slack instead of the Devin app is the single most convincing moment of the demo: it shows Devin lives where engineers already work. If Slack setup is a hassle, skip it and start the session from the Devin app; you lose a little polish, not the story.</w:t>
+        <w:t xml:space="preserve"> The panel will ask "what is in the playbook?" You should answer from memory in two sentences.</w:t>
       </w:r>
     </w:p>
     <w:p>
@@ -965,7 +916,7 @@
         <w:pStyle w:val="Heading2"/>
       </w:pPr>
       <w:r>
-        <w:t>B7. Run the demo session once, end to end (your safety net)</w:t>
+        <w:t>B6. Turn on Devin Review</w:t>
       </w:r>
     </w:p>
     <w:p>
@@ -976,54 +927,16 @@
         <w:t>Do.</w:t>
       </w:r>
       <w:r>
-        <w:t xml:space="preserve"> In Slack (or in Devin: </w:t>
+        <w:t xml:space="preserve"> </w:t>
       </w:r>
       <w:r>
         <w:rPr>
           <w:b/>
         </w:rPr>
-        <w:t>New session</w:t>
+        <w:t>Settings → Review</w:t>
       </w:r>
       <w:r>
-        <w:t>), send exactly the prompt from Part C, Step 2. Let it run to completion (typically 10-25 minutes). Confirm:</w:t>
-      </w:r>
-    </w:p>
-    <w:p>
-      <w:pPr>
-        <w:pStyle w:val="ListBullet"/>
-      </w:pPr>
-      <w:r>
-        <w:t>a PR opened on your fork,</w:t>
-      </w:r>
-    </w:p>
-    <w:p>
-      <w:pPr>
-        <w:pStyle w:val="ListBullet"/>
-      </w:pPr>
-      <w:r>
-        <w:t>tests passed in the session,</w:t>
-      </w:r>
-    </w:p>
-    <w:p>
-      <w:pPr>
-        <w:pStyle w:val="ListBullet"/>
-      </w:pPr>
-      <w:r>
-        <w:t>Devin Review left comments on the PR.</w:t>
-      </w:r>
-    </w:p>
-    <w:p>
-      <w:r>
-        <w:t xml:space="preserve">Leave that PR </w:t>
-      </w:r>
-      <w:r>
-        <w:rPr>
-          <w:b/>
-        </w:rPr>
-        <w:t>open</w:t>
-      </w:r>
-      <w:r>
-        <w:t>. Note its URL. Rename the session something obvious like "DEMO BACKUP — markdown report format".</w:t>
+        <w:t xml:space="preserve"> (or the Review tab): enable for both forks. Open your existing upgrade PRs and confirm Devin Review commented. If not, push an empty commit or ask Review to run.</w:t>
       </w:r>
     </w:p>
     <w:p>
@@ -1034,7 +947,7 @@
         <w:t>Why.</w:t>
       </w:r>
       <w:r>
-        <w:t xml:space="preserve"> This is your fallback. If the live session is slow or the Wi-Fi drops, you open this session's transcript and PR and narrate it. It also tells you whether the prompt needs tweaking before you say it in front of a panel.</w:t>
+        <w:t xml:space="preserve"> Review is the "second reader" that answers Capital One's own AI-readiness warning about weak review.</w:t>
       </w:r>
     </w:p>
     <w:p>
@@ -1042,7 +955,7 @@
         <w:pStyle w:val="Heading2"/>
       </w:pPr>
       <w:r>
-        <w:t>B8. Create the Automation</w:t>
+        <w:t>B7. Connect Slack (optional but strong)</w:t>
       </w:r>
     </w:p>
     <w:p>
@@ -1053,64 +966,114 @@
         <w:t>Do.</w:t>
       </w:r>
       <w:r>
-        <w:t xml:space="preserve"> In Devin, open </w:t>
+        <w:t xml:space="preserve"> </w:t>
       </w:r>
       <w:r>
         <w:rPr>
           <w:b/>
         </w:rPr>
-        <w:t>Automations</w:t>
+        <w:t>Settings → Integrations → Slack</w:t>
       </w:r>
       <w:r>
-        <w:t xml:space="preserve"> (left sidebar) → </w:t>
+        <w:t xml:space="preserve"> → install, pick a channel (e.g. </w:t>
+      </w:r>
+      <w:r>
+        <w:rPr>
+          <w:rFonts w:ascii="Consolas" w:hAnsi="Consolas"/>
+          <w:sz w:val="20"/>
+        </w:rPr>
+        <w:t>#eng-modernization</w:t>
+      </w:r>
+      <w:r>
+        <w:t xml:space="preserve">). Test with </w:t>
+      </w:r>
+      <w:r>
+        <w:rPr>
+          <w:rFonts w:ascii="Consolas" w:hAnsi="Consolas"/>
+          <w:sz w:val="20"/>
+        </w:rPr>
+        <w:t>@Devin hello</w:t>
+      </w:r>
+      <w:r>
+        <w:t>.</w:t>
+      </w:r>
+    </w:p>
+    <w:p>
+      <w:r>
+        <w:rPr>
+          <w:b/>
+        </w:rPr>
+        <w:t>Why.</w:t>
+      </w:r>
+      <w:r>
+        <w:t xml:space="preserve"> Starting the session from Slack shows Devin lives where engineers already work. If it misbehaves, start from the app; same thing.</w:t>
+      </w:r>
+    </w:p>
+    <w:p>
+      <w:pPr>
+        <w:pStyle w:val="Heading2"/>
+      </w:pPr>
+      <w:r>
+        <w:t>B8. The backup run (your safety net, and your main exhibit)</w:t>
+      </w:r>
+    </w:p>
+    <w:p>
+      <w:r>
+        <w:rPr>
+          <w:b/>
+        </w:rPr>
+        <w:t>Do.</w:t>
+      </w:r>
+      <w:r>
+        <w:t xml:space="preserve"> In Slack or </w:t>
       </w:r>
       <w:r>
         <w:rPr>
           <w:b/>
         </w:rPr>
-        <w:t>New automation</w:t>
+        <w:t>New session</w:t>
       </w:r>
       <w:r>
-        <w:t>. Configure:</w:t>
+        <w:t>, send the exact prompt from Part C Step 2. Let it run to the end (expect 30-60 minutes for both repos). Confirm: one PR on core, one on api, tests green in the transcript, Review comments on both. Rename the session "DEMO BACKUP — Java 17 upgrade". Bookmark the session and both PRs.</w:t>
+      </w:r>
+    </w:p>
+    <w:p>
+      <w:r>
+        <w:rPr>
+          <w:b/>
+        </w:rPr>
+        <w:t>Why.</w:t>
+      </w:r>
+      <w:r>
+        <w:t xml:space="preserve"> If the live session is slow, you open this one. Even if the live one is fast, this is where the finished diff lives.</w:t>
       </w:r>
     </w:p>
     <w:p>
       <w:pPr>
-        <w:pStyle w:val="ListBullet"/>
+        <w:pStyle w:val="Heading2"/>
       </w:pPr>
+      <w:r>
+        <w:t>B9. Create the Automation</w:t>
+      </w:r>
+    </w:p>
+    <w:p>
       <w:r>
         <w:rPr>
           <w:b/>
         </w:rPr>
-        <w:t>Trigger:</w:t>
+        <w:t>Do.</w:t>
       </w:r>
       <w:r>
-        <w:t xml:space="preserve"> Schedule, weekly (e.g., Mondays 07:00).</w:t>
+        <w:t xml:space="preserve"> </w:t>
       </w:r>
-    </w:p>
-    <w:p>
-      <w:pPr>
-        <w:pStyle w:val="ListBullet"/>
-      </w:pPr>
       <w:r>
         <w:rPr>
           <w:b/>
         </w:rPr>
-        <w:t>Repo:</w:t>
+        <w:t>Automations → New automation</w:t>
       </w:r>
       <w:r>
-        <w:t xml:space="preserve"> the fork.</w:t>
-      </w:r>
-    </w:p>
-    <w:p>
-      <w:pPr>
-        <w:pStyle w:val="ListBullet"/>
-      </w:pPr>
-      <w:r>
-        <w:rPr>
-          <w:b/>
-        </w:rPr>
-        <w:t>Instructions:</w:t>
+        <w:t>: Schedule, weekly (Mondays 07:00); repos: both forks; instructions:</w:t>
       </w:r>
     </w:p>
     <w:p>
@@ -1125,7 +1088,7 @@
           <w:rFonts w:ascii="Consolas" w:hAnsi="Consolas"/>
           <w:sz w:val="20"/>
         </w:rPr>
-        <w:t>pip-audit</w:t>
+        <w:t>mvn versions:display-dependency-updates</w:t>
       </w:r>
       <w:r>
         <w:t xml:space="preserve"> and </w:t>
@@ -1135,39 +1098,35 @@
           <w:rFonts w:ascii="Consolas" w:hAnsi="Consolas"/>
           <w:sz w:val="20"/>
         </w:rPr>
-        <w:t>pip list --outdated</w:t>
+        <w:t>mvn org.owasp:dependency-check-maven:check</w:t>
       </w:r>
       <w:r>
-        <w:t xml:space="preserve"> in the DataProfiler repo. For each dependency with a known vulnerability (CVE) or a safe minor/patch upgrade, bump it in </w:t>
+        <w:t xml:space="preserve"> in hygieia-core and api. For each dependency with a known CVE or a safe minor/patch upgrade, bump it in </w:t>
       </w:r>
       <w:r>
         <w:rPr>
           <w:rFonts w:ascii="Consolas" w:hAnsi="Consolas"/>
           <w:sz w:val="20"/>
         </w:rPr>
-        <w:t>requirements*.txt</w:t>
+        <w:t>pom.xml</w:t>
       </w:r>
       <w:r>
-        <w:t>, run the profiler tests, and open one PR per dependency with the CVE ID in the title. Post a summary of what was opened (and anything that failed tests) to Slack #eng-data-governance.</w:t>
+        <w:t xml:space="preserve">, run </w:t>
       </w:r>
-    </w:p>
-    <w:p>
-      <w:pPr>
-        <w:pStyle w:val="ListBullet"/>
-      </w:pPr>
       <w:r>
         <w:rPr>
-          <w:b/>
+          <w:rFonts w:ascii="Consolas" w:hAnsi="Consolas"/>
+          <w:sz w:val="20"/>
         </w:rPr>
-        <w:t>Deliver to:</w:t>
+        <w:t>mvn -B clean install</w:t>
       </w:r>
       <w:r>
-        <w:t xml:space="preserve"> Slack channel (if connected).</w:t>
+        <w:t>, and open one PR per dependency with the CVE ID in the title. Post a summary of PRs opened and anything that failed tests to Slack.</w:t>
       </w:r>
     </w:p>
     <w:p>
       <w:r>
-        <w:t xml:space="preserve">Save it, then click </w:t>
+        <w:t xml:space="preserve">Deliver to the Slack channel. Save and click </w:t>
       </w:r>
       <w:r>
         <w:rPr>
@@ -1176,7 +1135,7 @@
         <w:t>Run now</w:t>
       </w:r>
       <w:r>
-        <w:t xml:space="preserve"> so it has at least one run in its history before the demo.</w:t>
+        <w:t xml:space="preserve"> so it has a run in its history.</w:t>
       </w:r>
     </w:p>
     <w:p>
@@ -1187,7 +1146,7 @@
         <w:t>Why.</w:t>
       </w:r>
       <w:r>
-        <w:t xml:space="preserve"> The automation is the "security debt stops accumulating" story. Showing a real past run (with a real PR or a "nothing to patch this week" message) is far stronger than describing it.</w:t>
+        <w:t xml:space="preserve"> This is the "security debt stops accumulating" story; a real past run beats a description.</w:t>
       </w:r>
     </w:p>
     <w:p>
@@ -1195,7 +1154,7 @@
         <w:pStyle w:val="Heading2"/>
       </w:pPr>
       <w:r>
-        <w:t>B9. Add one Knowledge item and check Secrets (30 seconds each)</w:t>
+        <w:t>B10. Knowledge, Secrets, dry run</w:t>
       </w:r>
     </w:p>
     <w:p>
@@ -1215,37 +1174,17 @@
         <w:t>Settings → Knowledge → Add</w:t>
       </w:r>
       <w:r>
-        <w:t xml:space="preserve">: "In DataProfiler, all new report output formats must be added to </w:t>
+        <w:t xml:space="preserve">: "Hygieia repos stay on Spring Boot 2.x. Upgrade hygieia-core before api and </w:t>
       </w:r>
       <w:r>
         <w:rPr>
           <w:rFonts w:ascii="Consolas" w:hAnsi="Consolas"/>
           <w:sz w:val="20"/>
         </w:rPr>
-        <w:t>report_helpers.py</w:t>
+        <w:t>mvn install</w:t>
       </w:r>
       <w:r>
-        <w:t xml:space="preserve"> and covered by tests in </w:t>
-      </w:r>
-      <w:r>
-        <w:rPr>
-          <w:rFonts w:ascii="Consolas" w:hAnsi="Consolas"/>
-          <w:sz w:val="20"/>
-        </w:rPr>
-        <w:t>dataprofiler/tests/profilers/</w:t>
-      </w:r>
-      <w:r>
-        <w:t xml:space="preserve">. Always run </w:t>
-      </w:r>
-      <w:r>
-        <w:rPr>
-          <w:rFonts w:ascii="Consolas" w:hAnsi="Consolas"/>
-          <w:sz w:val="20"/>
-        </w:rPr>
-        <w:t>pre-commit run --all-files</w:t>
-      </w:r>
-      <w:r>
-        <w:t xml:space="preserve"> before opening a PR." Then open </w:t>
+        <w:t xml:space="preserve"> core locally first. Never skip tests." Glance at </w:t>
       </w:r>
       <w:r>
         <w:rPr>
@@ -1254,7 +1193,7 @@
         <w:t>Settings → Secrets</w:t>
       </w:r>
       <w:r>
-        <w:t xml:space="preserve"> and glance at it so you know what it looks like.</w:t>
+        <w:t>. Then run Part C once with a timer. Bookmark tabs in order: (1) Wiki, (2) Slack / new session, (3) backup session, (4) core PR, (5) api PR, (6) Automations, (7) Settings. Take a screenshot of each.</w:t>
       </w:r>
     </w:p>
     <w:p>
@@ -1265,20 +1204,7 @@
         <w:t>Why.</w:t>
       </w:r>
       <w:r>
-        <w:t xml:space="preserve"> Knowledge is how a team teaches Devin its conventions once, for everyone. Secrets is where API keys live so they are injected into the VM at runtime and never appear in a transcript. You will point at both in Step 5.</w:t>
-      </w:r>
-    </w:p>
-    <w:p>
-      <w:pPr>
-        <w:pStyle w:val="Heading2"/>
-      </w:pPr>
-      <w:r>
-        <w:t>B10. Dry run</w:t>
-      </w:r>
-    </w:p>
-    <w:p>
-      <w:r>
-        <w:t>Run Part C once with a timer. Bookmark these tabs in order: (1) Wiki page, (2) Slack channel or Devin new-session page, (3) the backup PR, (4) Automations page, (5) Settings. Close everything else.</w:t>
+        <w:t xml:space="preserve"> Knowledge is how a team teaches Devin its conventions once. Secrets is where credentials live so they never appear in a transcript. Both get pointed at in Step 5.</w:t>
       </w:r>
     </w:p>
     <w:p>
@@ -1291,7 +1217,7 @@
     </w:p>
     <w:p>
       <w:r>
-        <w:t>Slide 11 ("Live demo storyline") should be on screen when you say "Let me show you." Then switch to the browser.</w:t>
+        <w:t>Slide 11 ("Live demo: Java 11 to 17 on Hygieia") should be on screen when you say "Let me show you." Then switch to the browser.</w:t>
       </w:r>
     </w:p>
     <w:p>
@@ -1310,7 +1236,7 @@
         <w:t>Do.</w:t>
       </w:r>
       <w:r>
-        <w:t xml:space="preserve"> Before anything else, go to Slack (or Devin → New session) and paste the Step 2 prompt. Hit enter. Then immediately switch to the Wiki tab.</w:t>
+        <w:t xml:space="preserve"> Go to Slack (or Devin → New session) and paste the Step 2 prompt. Hit enter. Switch to the Wiki tab.</w:t>
       </w:r>
     </w:p>
     <w:p>
@@ -1321,7 +1247,7 @@
         <w:t>Why.</w:t>
       </w:r>
       <w:r>
-        <w:t xml:space="preserve"> Devin needs 10-20 minutes to finish. Starting it now means it is producing a PR right when you reach Step 2, instead of the room watching a progress bar. Nobody minds that you started it early; say so.</w:t>
+        <w:t xml:space="preserve"> The upgrade takes far longer than the demo. Starting it now means that by Step 2 it is visibly building and testing, not sitting at "cloning".</w:t>
       </w:r>
     </w:p>
     <w:p>
@@ -1332,7 +1258,7 @@
         <w:t>Say.</w:t>
       </w:r>
       <w:r>
-        <w:t xml:space="preserve"> "I'm going to hand Devin a real ticket right now, and we'll come back to it. While it works, let me show you what a new engineer sees on day one."</w:t>
+        <w:t xml:space="preserve"> "I'm handing Devin a real modernization ticket right now, Java 11 to 17 on your own Hygieia code, and we'll come back to it. While it works, let me show you what a new engineer sees on day one."</w:t>
       </w:r>
     </w:p>
     <w:p>
@@ -1351,30 +1277,17 @@
         <w:t>Do.</w:t>
       </w:r>
       <w:r>
-        <w:t xml:space="preserve"> Open the Wiki for the fork. Show the overview page and the architecture diagram. Click into "Profilers" or "Reports" for five seconds. Then type in the chat box:</w:t>
-      </w:r>
-    </w:p>
-    <w:p>
-      <w:pPr>
-        <w:ind w:left="576"/>
-      </w:pPr>
-      <w:r>
-        <w:t xml:space="preserve">How does </w:t>
+        <w:t xml:space="preserve"> Open the </w:t>
       </w:r>
       <w:r>
         <w:rPr>
           <w:rFonts w:ascii="Consolas" w:hAnsi="Consolas"/>
           <w:sz w:val="20"/>
         </w:rPr>
-        <w:t>Profiler.report()</w:t>
+        <w:t>hygieia-core</w:t>
       </w:r>
       <w:r>
-        <w:t xml:space="preserve"> choose an output format, and where are the formats tested?</w:t>
-      </w:r>
-    </w:p>
-    <w:p>
-      <w:r>
-        <w:t>Read the first two sentences of the answer aloud and click one of the file links it cites.</w:t>
+        <w:t xml:space="preserve"> Wiki. Show the module map and the core → api dependency page. In the chat box type the B4 question. Read two sentences of the answer aloud.</w:t>
       </w:r>
     </w:p>
     <w:p>
@@ -1385,7 +1298,7 @@
         <w:t>Why.</w:t>
       </w:r>
       <w:r>
-        <w:t xml:space="preserve"> Capital One is absorbing Discover's engineers, and both sides have thousands of undocumented services. The Wiki is generated from the code and stays current; nobody has to write or maintain it.</w:t>
+        <w:t xml:space="preserve"> Legacy code with no authors left is the Discover problem in miniature. Devin produced this from the code and keeps it current.</w:t>
       </w:r>
     </w:p>
     <w:p>
@@ -1396,7 +1309,7 @@
         <w:t>Say.</w:t>
       </w:r>
       <w:r>
-        <w:t xml:space="preserve"> "This documentation did not exist yesterday. Devin wrote it from the code, and it re-generates as the code changes. A Discover engineer landing in a Capital One repo gets this on Monday morning instead of booking time with your most senior person. And notice that Devin already understands this codebase, which matters for what comes next."</w:t>
+        <w:t xml:space="preserve"> "Nobody who wrote Hygieia still works on it; the upstream project is archived. Devin generated this map from the code, and it answers the question a new Discover engineer would otherwise spend a day asking around for. Itaú keeps documentation like this current on 300,000 repos."</w:t>
       </w:r>
     </w:p>
     <w:p>
@@ -1415,7 +1328,7 @@
         <w:pStyle w:val="Heading2"/>
       </w:pPr>
       <w:r>
-        <w:t>Step 2 (minutes 4-9) — Session: ticket to PR</w:t>
+        <w:t>Step 2 (minutes 4-9) — Playbook + Session: ticket to PR</w:t>
       </w:r>
     </w:p>
     <w:p>
@@ -1434,87 +1347,17 @@
         <w:ind w:left="576"/>
       </w:pPr>
       <w:r>
-        <w:t xml:space="preserve">@Devin In the DataProfiler fork, add a </w:t>
+        <w:t xml:space="preserve">@Devin !java17_upgrade on robertsljoseph-crypto/hygieia-core and then robertsljoseph-crypto/api. Baseline build and tests on Java 11 first, upgrade core and </w:t>
       </w:r>
       <w:r>
         <w:rPr>
           <w:rFonts w:ascii="Consolas" w:hAnsi="Consolas"/>
           <w:sz w:val="20"/>
         </w:rPr>
-        <w:t>markdown</w:t>
+        <w:t>mvn install</w:t>
       </w:r>
       <w:r>
-        <w:t xml:space="preserve"> option to </w:t>
-      </w:r>
-      <w:r>
-        <w:rPr>
-          <w:rFonts w:ascii="Consolas" w:hAnsi="Consolas"/>
-          <w:sz w:val="20"/>
-        </w:rPr>
-        <w:t>report_options["output_format"]</w:t>
-      </w:r>
-      <w:r>
-        <w:t xml:space="preserve"> alongside </w:t>
-      </w:r>
-      <w:r>
-        <w:rPr>
-          <w:rFonts w:ascii="Consolas" w:hAnsi="Consolas"/>
-          <w:sz w:val="20"/>
-        </w:rPr>
-        <w:t>pretty</w:t>
-      </w:r>
-      <w:r>
-        <w:t xml:space="preserve">, </w:t>
-      </w:r>
-      <w:r>
-        <w:rPr>
-          <w:rFonts w:ascii="Consolas" w:hAnsi="Consolas"/>
-          <w:sz w:val="20"/>
-        </w:rPr>
-        <w:t>compact</w:t>
-      </w:r>
-      <w:r>
-        <w:t xml:space="preserve">, </w:t>
-      </w:r>
-      <w:r>
-        <w:rPr>
-          <w:rFonts w:ascii="Consolas" w:hAnsi="Consolas"/>
-          <w:sz w:val="20"/>
-        </w:rPr>
-        <w:t>serializable</w:t>
-      </w:r>
-      <w:r>
-        <w:t xml:space="preserve"> and </w:t>
-      </w:r>
-      <w:r>
-        <w:rPr>
-          <w:rFonts w:ascii="Consolas" w:hAnsi="Consolas"/>
-          <w:sz w:val="20"/>
-        </w:rPr>
-        <w:t>flat</w:t>
-      </w:r>
-      <w:r>
-        <w:t xml:space="preserve"> in </w:t>
-      </w:r>
-      <w:r>
-        <w:rPr>
-          <w:rFonts w:ascii="Consolas" w:hAnsi="Consolas"/>
-          <w:sz w:val="20"/>
-        </w:rPr>
-        <w:t>dataprofiler/profilers/helpers/report_helpers.py</w:t>
-      </w:r>
-      <w:r>
-        <w:t xml:space="preserve">. It should render the global stats and each column's stats as Markdown tables suitable for pasting into a PR or a data-governance ticket, handle nested dicts / None / numpy types the same way </w:t>
-      </w:r>
-      <w:r>
-        <w:rPr>
-          <w:rFonts w:ascii="Consolas" w:hAnsi="Consolas"/>
-          <w:sz w:val="20"/>
-        </w:rPr>
-        <w:t>pretty</w:t>
-      </w:r>
-      <w:r>
-        <w:t xml:space="preserve"> does, include unit tests next to the existing report-format tests, and add a line to the changelog. Run the profiler tests and pre-commit, then open a PR.</w:t>
+        <w:t xml:space="preserve"> it locally, then api. Keep Spring Boot 2.x. Fix anything that breaks, do not skip tests, and open one PR per repo with a summary of the changes.</w:t>
       </w:r>
     </w:p>
     <w:p>
@@ -1523,9 +1366,6 @@
           <w:b/>
         </w:rPr>
         <w:t>Do.</w:t>
-      </w:r>
-      <w:r>
-        <w:t xml:space="preserve"> Switch to the session. Walk down the screen top to bottom:</w:t>
       </w:r>
     </w:p>
     <w:p>
@@ -1542,7 +1382,7 @@
         <w:t>The plan.</w:t>
       </w:r>
       <w:r>
-        <w:t xml:space="preserve"> Devin's first message is a plan: files it will touch, tests it will add. Read two bullets aloud.</w:t>
+        <w:t xml:space="preserve"> Devin's first message is a plan expanded from the playbook. Read two bullets aloud, including the core-before-api ordering.</w:t>
       </w:r>
     </w:p>
     <w:p>
@@ -1559,17 +1399,17 @@
         <w:t>The VM.</w:t>
       </w:r>
       <w:r>
-        <w:t xml:space="preserve"> Show the terminal / editor / browser tabs on the right. Point out it is running </w:t>
+        <w:t xml:space="preserve"> Show the terminal running </w:t>
       </w:r>
       <w:r>
         <w:rPr>
           <w:rFonts w:ascii="Consolas" w:hAnsi="Consolas"/>
           <w:sz w:val="20"/>
         </w:rPr>
-        <w:t>pytest</w:t>
+        <w:t>mvn -B clean install</w:t>
       </w:r>
       <w:r>
-        <w:t>.</w:t>
+        <w:t>. Say what it is doing.</w:t>
       </w:r>
     </w:p>
     <w:p>
@@ -1583,10 +1423,10 @@
         <w:rPr>
           <w:b/>
         </w:rPr>
-        <w:t>The progress.</w:t>
+        <w:t>Switch to the backup session</w:t>
       </w:r>
       <w:r>
-        <w:t xml:space="preserve"> Scroll the transcript. If it is mid-run, show it fixing a failing test. If it is finished, click the PR link.</w:t>
+        <w:t xml:space="preserve"> ("let me show you the one I ran earlier so you can see the finished result"). Scroll to where it hit a Java 17 failure and fixed it.</w:t>
       </w:r>
     </w:p>
     <w:p>
@@ -1600,15 +1440,30 @@
         <w:rPr>
           <w:b/>
         </w:rPr>
-        <w:t>The PR.</w:t>
+        <w:t>The PRs.</w:t>
       </w:r>
       <w:r>
-        <w:t xml:space="preserve"> Open the PR on GitHub. Show the description (Devin explains what and why), the diff, and the CI status check.</w:t>
+        <w:t xml:space="preserve"> Open the core PR: </w:t>
       </w:r>
-    </w:p>
-    <w:p>
       <w:r>
-        <w:t>If Devin is still running, say "It's still testing; let me show you the one I ran last night," and open the backup PR. Same narration.</w:t>
+        <w:rPr>
+          <w:rFonts w:ascii="Consolas" w:hAnsi="Consolas"/>
+          <w:sz w:val="20"/>
+        </w:rPr>
+        <w:t>pom.xml</w:t>
+      </w:r>
+      <w:r>
+        <w:t xml:space="preserve"> diff (Java 17, plugin versions), a rewritten test, Dockerfile on </w:t>
+      </w:r>
+      <w:r>
+        <w:rPr>
+          <w:rFonts w:ascii="Consolas" w:hAnsi="Consolas"/>
+          <w:sz w:val="20"/>
+        </w:rPr>
+        <w:t>eclipse-temurin:17</w:t>
+      </w:r>
+      <w:r>
+        <w:t>, CI green, PR description. Then the api PR in ten seconds: "same playbook, second repo."</w:t>
       </w:r>
     </w:p>
     <w:p>
@@ -1619,7 +1474,7 @@
         <w:t>Why.</w:t>
       </w:r>
       <w:r>
-        <w:t xml:space="preserve"> This is the core of Devin: a ticket in, a tested PR out, with no one at the keyboard. For the Discover integration that means dozens of these running in parallel against a migration checklist.</w:t>
+        <w:t xml:space="preserve"> This is Devin's core value: a playbook written once, run against every service, each producing a tested PR with no one at the keyboard.</w:t>
       </w:r>
     </w:p>
     <w:p>
@@ -1630,7 +1485,7 @@
         <w:t>Say.</w:t>
       </w:r>
       <w:r>
-        <w:t xml:space="preserve"> "This came in as a Slack message. Devin planned it, worked in its own sandboxed machine, ran your test suite and your linters, and opened a pull request. The unit of delivery is a PR that already passed your tests, not a code suggestion someone has to finish. Now imagine twenty of these running at once against the Discover migration backlog. That is how Nubank did an eight-year migration in twelve months."</w:t>
+        <w:t xml:space="preserve"> "A human wrote this playbook once. Devin ran it: baseline on 11, upgrade, fix what broke, test, PR. It did not skip the failing tests or paper over them with JVM flags; it fixed them. Now point the same playbook at the next fifty Java services. That is how Itaú moved 59 services from .NET to Java six times faster, and how Nubank did a multi-million-line refactor eight to twelve times faster."</w:t>
       </w:r>
     </w:p>
     <w:p>
@@ -1638,10 +1493,10 @@
         <w:rPr>
           <w:b/>
         </w:rPr>
-        <w:t>What to point at for the CISO:</w:t>
+        <w:t>For the CISO:</w:t>
       </w:r>
       <w:r>
-        <w:t xml:space="preserve"> "The PR is opened by the Devin GitHub App, not by anyone's personal account. It cannot merge; your branch protection is untouched."</w:t>
+        <w:t xml:space="preserve"> "The PR is opened by the Devin GitHub App, not a person's account. It cannot merge; your branch protection is untouched, and every command it ran is in this transcript."</w:t>
       </w:r>
     </w:p>
     <w:p>
@@ -1652,7 +1507,7 @@
         <w:t>Tie to slide 4:</w:t>
       </w:r>
       <w:r>
-        <w:t xml:space="preserve"> data-governance tooling; Discover integration at scale.</w:t>
+        <w:t xml:space="preserve"> Discover integration; modernization at scale.</w:t>
       </w:r>
     </w:p>
     <w:p>
@@ -1671,17 +1526,7 @@
         <w:t>Do.</w:t>
       </w:r>
       <w:r>
-        <w:t xml:space="preserve"> On the PR (live or backup), scroll to the comments. Devin Review will have left inline comments: an edge case (e.g., nested dictionaries or </w:t>
-      </w:r>
-      <w:r>
-        <w:rPr>
-          <w:rFonts w:ascii="Consolas" w:hAnsi="Consolas"/>
-          <w:sz w:val="20"/>
-        </w:rPr>
-        <w:t>None</w:t>
-      </w:r>
-      <w:r>
-        <w:t xml:space="preserve"> values), a type hint, a style rule. Pick one and read it aloud. If time allows, reply in the PR or in the session: "Devin, address the review comment about None values" and show it acknowledge.</w:t>
+        <w:t xml:space="preserve"> On the core PR, scroll to Devin Review's comments. Pick one concrete comment (a plugin version choice, a test dependency leaking into compile scope) and read it aloud.</w:t>
       </w:r>
     </w:p>
     <w:p>
@@ -1692,7 +1537,7 @@
         <w:t>Why.</w:t>
       </w:r>
       <w:r>
-        <w:t xml:space="preserve"> At a bank, code review is a control, and it is the control that gets thin when volume goes up. Review gives every PR a consistent second reader and leaves a written trail.</w:t>
+        <w:t xml:space="preserve"> Capital One's own engineers have warned publicly about AI code plus weak review. Review is the answer, and it leaves a written trail.</w:t>
       </w:r>
     </w:p>
     <w:p>
@@ -1703,7 +1548,7 @@
         <w:t>Say.</w:t>
       </w:r>
       <w:r>
-        <w:t xml:space="preserve"> "Every PR in this repo, whether a human or Devin wrote it, gets this. It reads the whole repo for context, not just the diff. For your Technology Risk team this is audit evidence being generated as code ships, not reconstructed at exam time."</w:t>
+        <w:t xml:space="preserve"> "Every PR, human or Devin, gets a second reader. This is the review trail your examiners ask for, generated as the code ships."</w:t>
       </w:r>
     </w:p>
     <w:p>
@@ -1714,7 +1559,7 @@
         <w:t>Tie to slide 4:</w:t>
       </w:r>
       <w:r>
-        <w:t xml:space="preserve"> compliance evidence and quality.</w:t>
+        <w:t xml:space="preserve"> AI-readiness; review capacity.</w:t>
       </w:r>
     </w:p>
     <w:p>
@@ -1742,27 +1587,7 @@
         <w:t>Automations</w:t>
       </w:r>
       <w:r>
-        <w:t xml:space="preserve">. Click the weekly dependency/CVE sweep. Show the schedule, the instructions, and the </w:t>
-      </w:r>
-      <w:r>
-        <w:rPr>
-          <w:b/>
-        </w:rPr>
-        <w:t>past run</w:t>
-      </w:r>
-      <w:r>
-        <w:t xml:space="preserve"> from yesterday. If it opened a PR, click it. If it posted to Slack, show the Slack message.</w:t>
-      </w:r>
-    </w:p>
-    <w:p>
-      <w:r>
-        <w:rPr>
-          <w:b/>
-        </w:rPr>
-        <w:t>Why.</w:t>
-      </w:r>
-      <w:r>
-        <w:t xml:space="preserve"> Vulnerability and dependency debt is a bank-wide, never-ending chore across thousands of repos. Automations turn it from an annual war room into a weekly background task with a named owner.</w:t>
+        <w:t>, show the weekly dependency/CVE sweep and its past run (PRs opened or "nothing to patch").</w:t>
       </w:r>
     </w:p>
     <w:p>
@@ -1773,7 +1598,7 @@
         <w:t>Say.</w:t>
       </w:r>
       <w:r>
-        <w:t xml:space="preserve"> "Nobody asked Devin to do this; it runs every Monday. Multiply this by a few thousand repos and mean time to patch drops from weeks to days, and the summary lands in the channel your security team already watches. You can build the same thing for framework upgrades, flaky tests, or Discover-to-Capital One migration checks."</w:t>
+        <w:t xml:space="preserve"> "This runs every Monday without anyone asking. Across thousands of repos this is how mean time to patch goes from weeks to days without a war room. Itaú auto-remediates about 70% of its security findings this way."</w:t>
       </w:r>
     </w:p>
     <w:p>
@@ -1784,7 +1609,7 @@
         <w:t>Tie to slide 4:</w:t>
       </w:r>
       <w:r>
-        <w:t xml:space="preserve"> security posture and CVE debt.</w:t>
+        <w:t xml:space="preserve"> security posture; CVE debt.</w:t>
       </w:r>
     </w:p>
     <w:p>
@@ -1803,7 +1628,7 @@
         <w:t>Do.</w:t>
       </w:r>
       <w:r>
-        <w:t xml:space="preserve"> Open </w:t>
+        <w:t xml:space="preserve"> </w:t>
       </w:r>
       <w:r>
         <w:rPr>
@@ -1812,82 +1637,7 @@
         <w:t>Settings</w:t>
       </w:r>
       <w:r>
-        <w:t xml:space="preserve"> and walk through, briefly, top to bottom:</w:t>
-      </w:r>
-    </w:p>
-    <w:p>
-      <w:pPr>
-        <w:pStyle w:val="ListBullet"/>
-      </w:pPr>
-      <w:r>
-        <w:rPr>
-          <w:b/>
-        </w:rPr>
-        <w:t>Members / SSO:</w:t>
-      </w:r>
-      <w:r>
-        <w:t xml:space="preserve"> "Access via your identity provider, SCIM provisioning, roles."</w:t>
-      </w:r>
-    </w:p>
-    <w:p>
-      <w:pPr>
-        <w:pStyle w:val="ListBullet"/>
-      </w:pPr>
-      <w:r>
-        <w:rPr>
-          <w:b/>
-        </w:rPr>
-        <w:t>Integrations → GitHub:</w:t>
-      </w:r>
-      <w:r>
-        <w:t xml:space="preserve"> "Scoped GitHub App; you saw it only has the one repo."</w:t>
-      </w:r>
-    </w:p>
-    <w:p>
-      <w:pPr>
-        <w:pStyle w:val="ListBullet"/>
-      </w:pPr>
-      <w:r>
-        <w:rPr>
-          <w:b/>
-        </w:rPr>
-        <w:t>Secrets:</w:t>
-      </w:r>
-      <w:r>
-        <w:t xml:space="preserve"> "Credentials are stored here and injected into the VM at runtime. They never appear in a transcript."</w:t>
-      </w:r>
-    </w:p>
-    <w:p>
-      <w:pPr>
-        <w:pStyle w:val="ListBullet"/>
-      </w:pPr>
-      <w:r>
-        <w:rPr>
-          <w:b/>
-        </w:rPr>
-        <w:t>Any session → transcript:</w:t>
-      </w:r>
-      <w:r>
-        <w:t xml:space="preserve"> "Every command Devin ran is recorded and replayable. This is the audit log."</w:t>
-      </w:r>
-    </w:p>
-    <w:p>
-      <w:pPr>
-        <w:pStyle w:val="ListBullet"/>
-      </w:pPr>
-      <w:r>
-        <w:t>Mention verbally: VPC / single-tenant deployment option, data retention controls, and that customer code is not used to train models.</w:t>
-      </w:r>
-    </w:p>
-    <w:p>
-      <w:r>
-        <w:rPr>
-          <w:b/>
-        </w:rPr>
-        <w:t>Why.</w:t>
-      </w:r>
-      <w:r>
-        <w:t xml:space="preserve"> The CISO cannot say yes, but can say no. This step removes the reasons to say no.</w:t>
+        <w:t>: SSO/SCIM, repository scoping, the GitHub App identity, Secrets, the session audit log (open the backup session's transcript: every Maven command replayable), data retention, VPC / single-tenant option.</w:t>
       </w:r>
     </w:p>
     <w:p>
@@ -1898,7 +1648,7 @@
         <w:t>Say.</w:t>
       </w:r>
       <w:r>
-        <w:t xml:space="preserve"> "Everything you just watched happened inside these controls: your identity provider, a scoped app identity, a secrets vault, and a replayable log of every action. This is the same review Goldman Sachs' technology risk team went through, and Devin is in production there today."</w:t>
+        <w:t xml:space="preserve"> "Devin has exactly the access you granted, acts under its own identity, keeps secrets out of transcripts, and every action is replayable. No training on your code. Goldman Sachs and Itaú have been through this review."</w:t>
       </w:r>
     </w:p>
     <w:p>
@@ -1909,7 +1659,7 @@
         <w:t>Tie to slide 4:</w:t>
       </w:r>
       <w:r>
-        <w:t xml:space="preserve"> AI at scale under bank-grade governance.</w:t>
+        <w:t xml:space="preserve"> bank-grade governance.</w:t>
       </w:r>
     </w:p>
     <w:p>
@@ -2038,7 +1788,7 @@
               <w:rPr>
                 <w:sz w:val="19"/>
               </w:rPr>
-              <w:t>Live session is slow or stuck</w:t>
+              <w:t>Live session slow or stuck</w:t>
             </w:r>
           </w:p>
         </w:tc>
@@ -2056,7 +1806,7 @@
               <w:rPr>
                 <w:sz w:val="19"/>
               </w:rPr>
-              <w:t>Open the backup session and PR from B7</w:t>
+              <w:t>Open the backup session and PRs from B8</w:t>
             </w:r>
           </w:p>
         </w:tc>
@@ -2074,7 +1824,7 @@
               <w:rPr>
                 <w:sz w:val="19"/>
               </w:rPr>
-              <w:t>"Still running the suite; here is the one from last night so you can see the finished result."</w:t>
+              <w:t>"The full upgrade takes about an hour; here is the finished one from earlier."</w:t>
             </w:r>
           </w:p>
         </w:tc>
@@ -2112,7 +1862,7 @@
               <w:rPr>
                 <w:sz w:val="19"/>
               </w:rPr>
-              <w:t>Click the Architecture page instead and narrate it</w:t>
+              <w:t>Open the module/architecture page and narrate it</w:t>
             </w:r>
           </w:p>
         </w:tc>
@@ -2168,7 +1918,7 @@
               <w:rPr>
                 <w:sz w:val="19"/>
               </w:rPr>
-              <w:t>Show the Review settings toggle and the backup PR's comments</w:t>
+              <w:t>Show the Review toggle and the backup PR's comments</w:t>
             </w:r>
           </w:p>
         </w:tc>
@@ -2186,7 +1936,7 @@
               <w:rPr>
                 <w:sz w:val="19"/>
               </w:rPr>
-              <w:t>"Review runs on every PR; here is what it flagged last night."</w:t>
+              <w:t>"Review runs on every PR; here is what it flagged earlier."</w:t>
             </w:r>
           </w:p>
         </w:tc>
@@ -2224,7 +1974,7 @@
               <w:rPr>
                 <w:sz w:val="19"/>
               </w:rPr>
-              <w:t>Click "Run now" and show it start; describe the Slack summary</w:t>
+              <w:t>Click "Run now" and show it start</w:t>
             </w:r>
           </w:p>
         </w:tc>
@@ -2262,7 +2012,7 @@
               <w:rPr>
                 <w:sz w:val="19"/>
               </w:rPr>
-              <w:t>Slack integration not working</w:t>
+              <w:t>Slack not working</w:t>
             </w:r>
           </w:p>
         </w:tc>
@@ -2318,6 +2068,62 @@
               <w:rPr>
                 <w:sz w:val="19"/>
               </w:rPr>
+              <w:t>Maven download errors in the live VM</w:t>
+            </w:r>
+          </w:p>
+        </w:tc>
+        <w:tc>
+          <w:tcPr>
+            <w:tcW w:type="dxa" w:w="3216"/>
+          </w:tcPr>
+          <w:p>
+            <w:r>
+              <w:rPr>
+                <w:sz w:val="19"/>
+              </w:rPr>
+            </w:r>
+            <w:r>
+              <w:rPr>
+                <w:sz w:val="19"/>
+              </w:rPr>
+              <w:t>Ignore; switch to the backup session</w:t>
+            </w:r>
+          </w:p>
+        </w:tc>
+        <w:tc>
+          <w:tcPr>
+            <w:tcW w:type="dxa" w:w="3216"/>
+          </w:tcPr>
+          <w:p>
+            <w:r>
+              <w:rPr>
+                <w:sz w:val="19"/>
+              </w:rPr>
+            </w:r>
+            <w:r>
+              <w:rPr>
+                <w:sz w:val="19"/>
+              </w:rPr>
+              <w:t>"Network hiccup in the sandbox; here is the completed run."</w:t>
+            </w:r>
+          </w:p>
+        </w:tc>
+      </w:tr>
+      <w:tr>
+        <w:tc>
+          <w:tcPr>
+            <w:tcW w:type="dxa" w:w="3216"/>
+          </w:tcPr>
+          <w:p>
+            <w:r>
+              <w:rPr>
+                <w:sz w:val="19"/>
+              </w:rPr>
+            </w:r>
+            <w:r>
+              <w:rPr>
+                <w:sz w:val="19"/>
+              </w:rPr>
               <w:t>Internet drops</w:t>
             </w:r>
           </w:p>
@@ -2336,7 +2142,7 @@
               <w:rPr>
                 <w:sz w:val="19"/>
               </w:rPr>
-              <w:t>Screenshots of each step saved to your desktop (take them during the dry run)</w:t>
+              <w:t>Screenshots from the dry run</w:t>
             </w:r>
           </w:p>
         </w:tc>
@@ -2362,11 +2168,6 @@
     </w:tbl>
     <w:p/>
     <w:p>
-      <w:r>
-        <w:t>Take screenshots of every step during the dry run and keep them in a folder on the desktop. That is your last line of defence.</w:t>
-      </w:r>
-    </w:p>
-    <w:p>
       <w:pPr>
         <w:pStyle w:val="Heading1"/>
       </w:pPr>
@@ -2388,7 +2189,17 @@
         <w:t>Min 0:</w:t>
       </w:r>
       <w:r>
-        <w:t xml:space="preserve"> paste prompt in Slack → start session.</w:t>
+        <w:t xml:space="preserve"> paste </w:t>
+      </w:r>
+      <w:r>
+        <w:rPr>
+          <w:rFonts w:ascii="Consolas" w:hAnsi="Consolas"/>
+          <w:sz w:val="20"/>
+        </w:rPr>
+        <w:t>!java17_upgrade</w:t>
+      </w:r>
+      <w:r>
+        <w:t xml:space="preserve"> prompt in Slack → start session.</w:t>
       </w:r>
     </w:p>
     <w:p>
@@ -2405,17 +2216,7 @@
         <w:t>Min 1-4:</w:t>
       </w:r>
       <w:r>
-        <w:t xml:space="preserve"> Wiki → ask the </w:t>
-      </w:r>
-      <w:r>
-        <w:rPr>
-          <w:rFonts w:ascii="Consolas" w:hAnsi="Consolas"/>
-          <w:sz w:val="20"/>
-        </w:rPr>
-        <w:t>report()</w:t>
-      </w:r>
-      <w:r>
-        <w:t xml:space="preserve"> question → "day one for a Discover engineer".</w:t>
+        <w:t xml:space="preserve"> Wiki → "what breaks on Java 17, and in what order?" → "day one for a Discover engineer".</w:t>
       </w:r>
     </w:p>
     <w:p>
@@ -2432,7 +2233,7 @@
         <w:t>Min 4-9:</w:t>
       </w:r>
       <w:r>
-        <w:t xml:space="preserve"> Session → plan, VM, tests, PR → "a PR that passed your tests, not a suggestion". Backup PR if slow.</w:t>
+        <w:t xml:space="preserve"> live session plan + build → backup session → core PR (pom, test, Dockerfile, CI) → api PR → "one playbook, every service".</w:t>
       </w:r>
     </w:p>
     <w:p>
@@ -2449,7 +2250,7 @@
         <w:t>Min 9-11:</w:t>
       </w:r>
       <w:r>
-        <w:t xml:space="preserve"> PR comments → "a second reader on every PR; audit evidence".</w:t>
+        <w:t xml:space="preserve"> Review comments on the PR → "a second reader on every PR; audit evidence".</w:t>
       </w:r>
     </w:p>
     <w:p>
@@ -2483,7 +2284,7 @@
         <w:t>Min 13-15:</w:t>
       </w:r>
       <w:r>
-        <w:t xml:space="preserve"> Settings → SSO, scoped GitHub App, Secrets, transcript → "Goldman went through this review".</w:t>
+        <w:t xml:space="preserve"> Settings → SSO, scoped GitHub App, Secrets, transcript → "Goldman and Itaú went through this review".</w:t>
       </w:r>
     </w:p>
     <w:p>

</xml_diff>